<commit_message>
Fill [Repo URL] placeholders with https://github.com/MecksonMfema/medfund
Cover page submission-artefacts block, section 2.6 credibility sentence,
Appendix B README pointer, and Appendix G.3 Product Readiness self-check
row all now carry the real repo URL so adjudicators reading the PDF have
a direct clickable path to the code (C1, 30% rubric).
</commit_message>
<xml_diff>
--- a/proposals/AI4I_Track3_Proposal_Draft.docx
+++ b/proposals/AI4I_Track3_Proposal_Draft.docx
@@ -63,7 +63,7 @@
         </w:numPr>
       </w:pPr>
       <w:r>
-        <w:t xml:space="preserve">Repository: [Repo URL, e.g., https://github.com/OWNER/REPO]. Access: public during the AI4I judging window (14 Jul to 1 Aug 2026), or private with judge accounts invited as read-only collaborators. State the access mode on the portal submission form.</w:t>
+        <w:t xml:space="preserve">Repository: https://github.com/MecksonMfema/medfund. Access: public during the AI4I judging window (14 Jul to 1 Aug 2026), or private with judge accounts invited as read-only collaborators. State the access mode on the portal submission form.</w:t>
       </w:r>
     </w:p>
     <w:p>
@@ -915,7 +915,7 @@
         <w:pStyle w:val="FirstParagraph"/>
       </w:pPr>
       <w:r>
-        <w:t xml:space="preserve">The GitHub repository is at [Repo URL] (Appendix B for full layout and README). At submission the repository contains around [N] merged commits across [M] services, with green CI, Testcontainers-backed integration tests, and dependency-locked manifests. No component gets claimed as production-ready when the component is not.</w:t>
+        <w:t xml:space="preserve">The GitHub repository is at https://github.com/MecksonMfema/medfund (Appendix B for full layout and README). At submission the repository contains around [N] merged commits across [M] services, with green CI, Testcontainers-backed integration tests, and dependency-locked manifests. No component gets claimed as production-ready when the component is not.</w:t>
       </w:r>
     </w:p>
     <w:p>

</xml_diff>

<commit_message>
Rebrand MedFund to InsureFlow across docs and proposals
</commit_message>
<xml_diff>
--- a/proposals/AI4I_Track3_Proposal_Draft.docx
+++ b/proposals/AI4I_Track3_Proposal_Draft.docx
@@ -2,13 +2,13 @@
 <file path=word/document.xml><?xml version="1.0" encoding="utf-8"?>
 <w:document xmlns:w="http://schemas.openxmlformats.org/wordprocessingml/2006/main" xmlns:m="http://schemas.openxmlformats.org/officeDocument/2006/math" xmlns:r="http://schemas.openxmlformats.org/officeDocument/2006/relationships" xmlns:o="urn:schemas-microsoft-com:office:office" xmlns:v="urn:schemas-microsoft-com:vml" xmlns:w10="urn:schemas-microsoft-com:office:word" xmlns:a="http://schemas.openxmlformats.org/drawingml/2006/main" xmlns:pic="http://schemas.openxmlformats.org/drawingml/2006/picture" xmlns:wp="http://schemas.openxmlformats.org/drawingml/2006/wordprocessingDrawing">
   <w:body>
-    <w:bookmarkStart w:id="50" w:name="product-name"/>
+    <w:bookmarkStart w:id="50" w:name="insureflow"/>
     <w:p>
       <w:pPr>
         <w:pStyle w:val="Heading1"/>
       </w:pPr>
       <w:r>
-        <w:t xml:space="preserve">[Product Name]</w:t>
+        <w:t xml:space="preserve">InsureFlow</w:t>
       </w:r>
     </w:p>
     <w:bookmarkStart w:id="20" w:name="X5a0a5ce1607a5f7bf6f07e5e59e3b7c59b1a9c5"/>
@@ -221,17 +221,17 @@
         <w:pStyle w:val="FirstParagraph"/>
       </w:pPr>
       <w:r>
-        <w:t xml:space="preserve">The common thread runs across all six problems. Zimbabwe lacks a modern, multi-tenant, AI-native core insurance operating platform to carry an insurer’s whole book across every line, currency, channel, and partner, from first quote to regulator return. [Product Name] fills the gap.</w:t>
+        <w:t xml:space="preserve">The common thread runs across all six problems. Zimbabwe lacks a modern, multi-tenant, AI-native core insurance operating platform to carry an insurer’s whole book across every line, currency, channel, and partner, from first quote to regulator return. InsureFlow fills the gap.</w:t>
       </w:r>
     </w:p>
     <w:bookmarkEnd w:id="21"/>
-    <w:bookmarkStart w:id="22" w:name="what-product-name-is"/>
+    <w:bookmarkStart w:id="22" w:name="what-insureflow-is"/>
     <w:p>
       <w:pPr>
         <w:pStyle w:val="Heading3"/>
       </w:pPr>
       <w:r>
-        <w:t xml:space="preserve">1.2 What [Product Name] is</w:t>
+        <w:t xml:space="preserve">1.2 What InsureFlow is</w:t>
       </w:r>
     </w:p>
     <w:p>
@@ -239,7 +239,7 @@
         <w:pStyle w:val="FirstParagraph"/>
       </w:pPr>
       <w:r>
-        <w:t xml:space="preserve">[Product Name] is a multi-tenant core insurance operating platform delivered as SaaS. The platform runs the full lifecycle: enrolment, policy administration, contributions and premium billing, provider network management, claims intake and adjudication, finance and regulatory reporting, and member engagement. AI enters at pricing, underwriting, fraud, adjudication, churn, document intelligence, and multilingual member service. The platform ships with seven role-scoped portals, a per-tenant hot-reloadable rules engine, and an evidence-grade audit trail. The design is modular. Large insurers adopt the whole platform. Microinsurers run only claims and engagement. Brokers run only enrolment and billing. TPAs run the platform for multiple carriers. Regulators consume the fraud graph and reporting API.</w:t>
+        <w:t xml:space="preserve">InsureFlow is a multi-tenant core insurance operating platform delivered as SaaS. The platform runs the full lifecycle: enrolment, policy administration, contributions and premium billing, provider network management, claims intake and adjudication, finance and regulatory reporting, and member engagement. AI enters at pricing, underwriting, fraud, adjudication, churn, document intelligence, and multilingual member service. The platform ships with seven role-scoped portals, a per-tenant hot-reloadable rules engine, and an evidence-grade audit trail. The design is modular. Large insurers adopt the whole platform. Microinsurers run only claims and engagement. Brokers run only enrolment and billing. TPAs run the platform for multiple carriers. Regulators consume the fraud graph and reporting API.</w:t>
       </w:r>
     </w:p>
     <w:bookmarkEnd w:id="22"/>
@@ -492,7 +492,7 @@
         <w:pStyle w:val="FirstParagraph"/>
       </w:pPr>
       <w:r>
-        <w:t xml:space="preserve">[Product Name] maps onto the Zimbabwe National AI Strategy 2026 to 2030, launched on 13 March 2026 by President E.D. Mnangagwa ⟨UNESCO, OECD.AI⟩. The platform matches Pillar 3 (AI Adoption in the priority financial-services sector), Pillar 4 (Governance and Ethics: every AI decision logs model version, features, confidence, and human review under the Cyber and Data Protection Act, Chapter 12:07), and Flagship 1 (the AI Grand Challenge, of which AI4I is the implementation vehicle). The design generalises across SADC. The Zimbabwean market runs small enough for a credible pilot. The pain (fraud, delay, dual currency, informal-sector gap, ISA-3 regulator expectations) appears in South Africa, Zambia, Malawi, Botswana, and Namibia.</w:t>
+        <w:t xml:space="preserve">InsureFlow maps onto the Zimbabwe National AI Strategy 2026 to 2030, launched on 13 March 2026 by President E.D. Mnangagwa ⟨UNESCO, OECD.AI⟩. The platform matches Pillar 3 (AI Adoption in the priority financial-services sector), Pillar 4 (Governance and Ethics: every AI decision logs model version, features, confidence, and human review under the Cyber and Data Protection Act, Chapter 12:07), and Flagship 1 (the AI Grand Challenge, of which AI4I is the implementation vehicle). The design generalises across SADC. The Zimbabwean market runs small enough for a credible pilot. The pain (fraud, delay, dual currency, informal-sector gap, ISA-3 regulator expectations) appears in South Africa, Zambia, Malawi, Botswana, and Namibia.</w:t>
       </w:r>
     </w:p>
     <w:p>
@@ -500,7 +500,7 @@
         <w:pStyle w:val="BodyText"/>
       </w:pPr>
       <w:r>
-        <w:t xml:space="preserve">Boundary statement: [Product Name] does not serve surveillance, credit denial, immigration profiling, or automated denial of care. Every high-value or contested decision keeps a human in the loop.</w:t>
+        <w:t xml:space="preserve">Boundary statement: InsureFlow does not serve surveillance, credit denial, immigration profiling, or automated denial of care. Every high-value or contested decision keeps a human in the loop.</w:t>
       </w:r>
     </w:p>
     <w:p>
@@ -535,7 +535,7 @@
         <w:pStyle w:val="FirstParagraph"/>
       </w:pPr>
       <w:r>
-        <w:t xml:space="preserve">[Product Name] runs as a family of loosely-coupled domain modules on a shared Kafka event backbone with a single AI service used by every module. Every module scopes to a tenant, tracks currency, instruments audit, and drives from rules. Users interact through six Angular web portals (super admin, tenant admin, operations and adjudicator, provider, group liaison, regulator read-only), plus a Flutter member app (Android, iOS, PWA, offline-first), a REST OpenAPI 3.1 surface for embedded-insurance partners, a multilingual chatbot (English, Shona, Ndebele), and webhook events for partner systems. Every portal scopes to a role, protects with MFA, and authenticates through OIDC.</w:t>
+        <w:t xml:space="preserve">InsureFlow runs as a family of loosely-coupled domain modules on a shared Kafka event backbone with a single AI service used by every module. Every module scopes to a tenant, tracks currency, instruments audit, and drives from rules. Users interact through six Angular web portals (super admin, tenant admin, operations and adjudicator, provider, group liaison, regulator read-only), plus a Flutter member app (Android, iOS, PWA, offline-first), a REST OpenAPI 3.1 surface for embedded-insurance partners, a multilingual chatbot (English, Shona, Ndebele), and webhook events for partner systems. Every portal scopes to a role, protects with MFA, and authenticates through OIDC.</w:t>
       </w:r>
     </w:p>
     <w:p>
@@ -599,7 +599,7 @@
         <w:t xml:space="preserve"> </w:t>
       </w:r>
       <w:r>
-        <w:t xml:space="preserve">designs. [Product Name] adopts an explicit rules-first principle. Any decision expressible as a deterministic lookup, inequality, or arithmetic operation goes to the Drools rules engine. The rules engine hot-reloads per tenant, versions cleanly, tests in isolation, and runs orders of magnitude cheaper than a model call. AI enters only where rules prove insufficient.</w:t>
+        <w:t xml:space="preserve">designs. InsureFlow adopts an explicit rules-first principle. Any decision expressible as a deterministic lookup, inequality, or arithmetic operation goes to the Drools rules engine. The rules engine hot-reloads per tenant, versions cleanly, tests in isolation, and runs orders of magnitude cheaper than a model call. AI enters only where rules prove insufficient.</w:t>
       </w:r>
     </w:p>
     <w:p>
@@ -1036,7 +1036,7 @@
         <w:t xml:space="preserve"> </w:t>
       </w:r>
       <w:r>
-        <w:t xml:space="preserve">AI Regulatory Sandbox ⟨National AI Strategy 2026, OECD.AI⟩. [Product Name] targets both.</w:t>
+        <w:t xml:space="preserve">AI Regulatory Sandbox ⟨National AI Strategy 2026, OECD.AI⟩. InsureFlow targets both.</w:t>
       </w:r>
     </w:p>
     <w:p>
@@ -1569,7 +1569,7 @@
         <w:pStyle w:val="FirstParagraph"/>
       </w:pPr>
       <w:r>
-        <w:t xml:space="preserve">[Product Name] runs as a B2B multi-tenant SaaS with four revenue lines: platform subscription (USD 8 k to 40 k per tenant per month across three tiers by active policy count), Module-as-a-Service for insurers with a legacy core (USD 2 k to 6 k per module per month across fraud, engagement, chatbot, regulatory return, risk pricing, each with an integration API), fraud recovery share (15% of documented fraud prevented pre-payment, capped per tenant. At sector fraud losses of USD 165 m per year, capturing even 5% funds the platform), and a regulator API priced at regulator level for IPEC and ZICB.</w:t>
+        <w:t xml:space="preserve">InsureFlow runs as a B2B multi-tenant SaaS with four revenue lines: platform subscription (USD 8 k to 40 k per tenant per month across three tiers by active policy count), Module-as-a-Service for insurers with a legacy core (USD 2 k to 6 k per module per month across fraud, engagement, chatbot, regulatory return, risk pricing, each with an integration API), fraud recovery share (15% of documented fraud prevented pre-payment, capped per tenant. At sector fraud losses of USD 165 m per year, capturing even 5% funds the platform), and a regulator API priced at regulator level for IPEC and ZICB.</w:t>
       </w:r>
     </w:p>
     <w:bookmarkEnd w:id="44"/>

</xml_diff>